<commit_message>
Fix docs to reflect that the merged inference model is excluded from git
The 2.9GB merged model is regenerated from the included LoRA adapter via
merge_lora.py rather than committed; response_engine.py already falls back
to loading base model + adapter directly if it's missing. Updated
README.md, HOW_TO_RUN.md, and the features/usage docx to describe this
correctly instead of claiming everything is pre-included.
</commit_message>
<xml_diff>
--- a/Adaptive_AI_Honeypot_Features_and_Usage.docx
+++ b/Adaptive_AI_Honeypot_Features_and_Usage.docx
@@ -2618,16 +2618,7 @@
         <w:spacing w:after="60"/>
       </w:pPr>
       <w:r>
-        <w:t>Python 3.10+ and the virtual environment already created at honeypot/.venv (or create a new one — see below).</w:t>
-      </w:r>
-    </w:p>
-    <w:p>
-      <w:pPr>
-        <w:pStyle w:val="ListBullet"/>
-        <w:spacing w:after="60"/>
-      </w:pPr>
-      <w:r>
-        <w:t>All dependencies already installed; requirements.txt is provided for a clean re-install.</w:t>
+        <w:t>Python 3.10+.</w:t>
       </w:r>
     </w:p>
     <w:p>
@@ -2640,7 +2631,7 @@
           <w:color w:val="1F7A6C"/>
           <w:sz w:val="27"/>
         </w:rPr>
-        <w:t>7.2 One-time setup (already done, included for reference)</w:t>
+        <w:t>7.2 One-time setup</w:t>
       </w:r>
     </w:p>
     <w:p>
@@ -2695,15 +2686,71 @@
         </w:rPr>
         <w:t>pip install -r requirements.txt</w:t>
       </w:r>
+    </w:p>
+    <w:p>
+      <w:pPr>
+        <w:spacing w:after="80"/>
+      </w:pPr>
       <w:r>
-        <w:br/>
+        <w:rPr>
+          <w:b w:val="0"/>
+          <w:i w:val="0"/>
+          <w:sz w:val="22"/>
+        </w:rPr>
+        <w:t>The LoRA adapter, both classifiers, and the synthetic training data are already checked into the repository (models/response_lora/, models/*.joblib, data/synthetic/) — nothing needs training before the honeypot can run. The merged inference model (models/response_merged/, ~2.9GB) is deliberately not checked into git, since it is rebuilt from the adapter above rather than being its own source artifact. The app works without it (response_engine.py automatically falls back to base model + adapter, a few seconds slower to start); to rebuild it once (no GPU retraining needed), run:</w:t>
       </w:r>
+    </w:p>
+    <w:p>
+      <w:pPr>
+        <w:spacing w:after="200"/>
+        <w:shd w:val="clear" w:fill="F2F2F2"/>
+        <w:pBdr>
+          <w:top w:val="single" w:sz="4" w:color="CCCCCC"/>
+          <w:left w:val="single" w:sz="4" w:color="CCCCCC"/>
+          <w:bottom w:val="single" w:sz="4" w:color="CCCCCC"/>
+          <w:right w:val="single" w:sz="4" w:color="CCCCCC"/>
+        </w:pBdr>
+      </w:pPr>
       <w:r>
         <w:rPr>
           <w:rFonts w:ascii="Consolas" w:hAnsi="Consolas"/>
           <w:color w:val="2A2A2A"/>
           <w:sz w:val="19"/>
         </w:rPr>
+        <w:t>python src/engine/merge_lora.py</w:t>
+      </w:r>
+    </w:p>
+    <w:p>
+      <w:pPr>
+        <w:spacing w:after="80"/>
+      </w:pPr>
+      <w:r>
+        <w:rPr>
+          <w:b w:val="0"/>
+          <w:i w:val="0"/>
+          <w:sz w:val="22"/>
+        </w:rPr>
+        <w:t>To regenerate the synthetic dataset, classifiers, or the LoRA adapter itself from scratch instead of using what is checked in:</w:t>
+      </w:r>
+    </w:p>
+    <w:p>
+      <w:pPr>
+        <w:spacing w:after="200"/>
+        <w:shd w:val="clear" w:fill="F2F2F2"/>
+        <w:pBdr>
+          <w:top w:val="single" w:sz="4" w:color="CCCCCC"/>
+          <w:left w:val="single" w:sz="4" w:color="CCCCCC"/>
+          <w:bottom w:val="single" w:sz="4" w:color="CCCCCC"/>
+          <w:right w:val="single" w:sz="4" w:color="CCCCCC"/>
+        </w:pBdr>
+      </w:pPr>
+      <w:r>
+        <w:rPr>
+          <w:rFonts w:ascii="Consolas" w:hAnsi="Consolas"/>
+          <w:color w:val="2A2A2A"/>
+          <w:sz w:val="19"/>
+        </w:rPr>
+        <w:t>python src/scripts/gen_dataset.py 1000     # synthetic sessions + LLM training pairs</w:t>
       </w:r>
       <w:r>
         <w:br/>
@@ -2714,50 +2761,7 @@
           <w:color w:val="2A2A2A"/>
           <w:sz w:val="19"/>
         </w:rPr>
-        <w:t># generate the synthetic training data</w:t>
-      </w:r>
-      <w:r>
-        <w:br/>
-      </w:r>
-      <w:r>
-        <w:rPr>
-          <w:rFonts w:ascii="Consolas" w:hAnsi="Consolas"/>
-          <w:color w:val="2A2A2A"/>
-          <w:sz w:val="19"/>
-        </w:rPr>
-        <w:t>python src/scripts/gen_dataset.py 1000</w:t>
-      </w:r>
-      <w:r>
-        <w:br/>
-      </w:r>
-      <w:r>
-        <w:rPr>
-          <w:rFonts w:ascii="Consolas" w:hAnsi="Consolas"/>
-          <w:color w:val="2A2A2A"/>
-          <w:sz w:val="19"/>
-        </w:rPr>
-      </w:r>
-      <w:r>
-        <w:br/>
-      </w:r>
-      <w:r>
-        <w:rPr>
-          <w:rFonts w:ascii="Consolas" w:hAnsi="Consolas"/>
-          <w:color w:val="2A2A2A"/>
-          <w:sz w:val="19"/>
-        </w:rPr>
-        <w:t># train the skill/intent classifiers</w:t>
-      </w:r>
-      <w:r>
-        <w:br/>
-      </w:r>
-      <w:r>
-        <w:rPr>
-          <w:rFonts w:ascii="Consolas" w:hAnsi="Consolas"/>
-          <w:color w:val="2A2A2A"/>
-          <w:sz w:val="19"/>
-        </w:rPr>
-        <w:t>python src/classifier/train.py</w:t>
+        <w:t>python src/classifier/train.py             # skill + intent XGBoost classifiers</w:t>
       </w:r>
       <w:r>
         <w:br/>
@@ -2779,6 +2783,7 @@
           <w:color w:val="2A2A2A"/>
           <w:sz w:val="19"/>
         </w:rPr>
+        <w:t>python src/engine/train_lora.py            # LoRA fine-tune (long-running, GPU required)</w:t>
       </w:r>
       <w:r>
         <w:br/>
@@ -2789,29 +2794,7 @@
           <w:color w:val="2A2A2A"/>
           <w:sz w:val="19"/>
         </w:rPr>
-        <w:t># fine-tune and merge the local response model (long-running, GPU required)</w:t>
-      </w:r>
-      <w:r>
-        <w:br/>
-      </w:r>
-      <w:r>
-        <w:rPr>
-          <w:rFonts w:ascii="Consolas" w:hAnsi="Consolas"/>
-          <w:color w:val="2A2A2A"/>
-          <w:sz w:val="19"/>
-        </w:rPr>
-        <w:t>python src/engine/train_lora.py</w:t>
-      </w:r>
-      <w:r>
-        <w:br/>
-      </w:r>
-      <w:r>
-        <w:rPr>
-          <w:rFonts w:ascii="Consolas" w:hAnsi="Consolas"/>
-          <w:color w:val="2A2A2A"/>
-          <w:sz w:val="19"/>
-        </w:rPr>
-        <w:t>python src/engine/merge_lora.py</w:t>
+        <w:t>python src/engine/merge_lora.py            # merge the new adapter for inference</w:t>
       </w:r>
     </w:p>
     <w:p>
@@ -3197,73 +3180,7 @@
           <w:color w:val="1F7A6C"/>
           <w:sz w:val="27"/>
         </w:rPr>
-        <w:t>7.5 Re-training from scratch</w:t>
-      </w:r>
-    </w:p>
-    <w:p>
-      <w:pPr>
-        <w:spacing w:after="120"/>
-      </w:pPr>
-      <w:r>
-        <w:rPr>
-          <w:b w:val="0"/>
-          <w:i w:val="0"/>
-          <w:sz w:val="22"/>
-        </w:rPr>
-        <w:t>If you want to regenerate everything (e.g. after changing a persona script or the Oracle's command handlers):</w:t>
-      </w:r>
-    </w:p>
-    <w:p>
-      <w:pPr>
-        <w:spacing w:after="200"/>
-        <w:shd w:val="clear" w:fill="F2F2F2"/>
-        <w:pBdr>
-          <w:top w:val="single" w:sz="4" w:color="CCCCCC"/>
-          <w:left w:val="single" w:sz="4" w:color="CCCCCC"/>
-          <w:bottom w:val="single" w:sz="4" w:color="CCCCCC"/>
-          <w:right w:val="single" w:sz="4" w:color="CCCCCC"/>
-        </w:pBdr>
-      </w:pPr>
-      <w:r>
-        <w:rPr>
-          <w:rFonts w:ascii="Consolas" w:hAnsi="Consolas"/>
-          <w:color w:val="2A2A2A"/>
-          <w:sz w:val="19"/>
-        </w:rPr>
-        <w:t>python src/scripts/gen_dataset.py 1000     # regenerate synthetic sessions</w:t>
-      </w:r>
-      <w:r>
-        <w:br/>
-      </w:r>
-      <w:r>
-        <w:rPr>
-          <w:rFonts w:ascii="Consolas" w:hAnsi="Consolas"/>
-          <w:color w:val="2A2A2A"/>
-          <w:sz w:val="19"/>
-        </w:rPr>
-        <w:t>python src/classifier/train.py             # retrain skill/intent classifiers</w:t>
-      </w:r>
-      <w:r>
-        <w:br/>
-      </w:r>
-      <w:r>
-        <w:rPr>
-          <w:rFonts w:ascii="Consolas" w:hAnsi="Consolas"/>
-          <w:color w:val="2A2A2A"/>
-          <w:sz w:val="19"/>
-        </w:rPr>
-        <w:t>python src/engine/train_lora.py             # retrain the response model (GPU, ~8 hrs on RTX 4070)</w:t>
-      </w:r>
-      <w:r>
-        <w:br/>
-      </w:r>
-      <w:r>
-        <w:rPr>
-          <w:rFonts w:ascii="Consolas" w:hAnsi="Consolas"/>
-          <w:color w:val="2A2A2A"/>
-          <w:sz w:val="19"/>
-        </w:rPr>
-        <w:t>python src/engine/merge_lora.py             # merge the new adapter for inference</w:t>
+        <w:t>7.5 Note on retraining</w:t>
       </w:r>
     </w:p>
     <w:p>
@@ -3277,7 +3194,7 @@
           <w:color w:val="5A5A5A"/>
           <w:sz w:val="20"/>
         </w:rPr>
-        <w:t>The LoRA training script checkpoints every epoch and resumes automatically if interrupted — it was in fact interrupted once during development and picked back up from the last checkpoint without losing progress or restarting.</w:t>
+        <w:t>The retraining commands for the synthetic dataset, classifiers, and LoRA adapter are given in §7.2 above. The LoRA training script checkpoints every epoch and resumes automatically if interrupted — it was in fact interrupted once during development and picked back up from the last checkpoint without losing progress or restarting.</w:t>
       </w:r>
     </w:p>
     <w:p>

</xml_diff>